<commit_message>
bedrocK 변환 및 Chrome Extension 자동화 기능 추가
</commit_message>
<xml_diff>
--- a/[진료] 의사결정 지원 시스템 사용자 시나리오.docx
+++ b/[진료] 의사결정 지원 시스템 사용자 시나리오.docx
@@ -126,9 +126,6 @@
         <w:pStyle w:val="a3"/>
         <w:spacing w:line="240" w:lineRule="auto"/>
         <w:ind w:leftChars="0"/>
-        <w:rPr>
-          <w:rFonts w:hint="eastAsia"/>
-        </w:rPr>
       </w:pPr>
       <w:r>
         <w:rPr>
@@ -251,6 +248,8 @@
         </w:rPr>
         <w:t>시놉시스</w:t>
       </w:r>
+      <w:bookmarkStart w:id="0" w:name="_GoBack"/>
+      <w:bookmarkEnd w:id="0"/>
     </w:p>
     <w:p>
       <w:pPr>
@@ -306,9 +305,6 @@
         <w:pStyle w:val="a3"/>
         <w:spacing w:line="240" w:lineRule="auto"/>
         <w:ind w:leftChars="0"/>
-        <w:rPr>
-          <w:rFonts w:hint="eastAsia"/>
-        </w:rPr>
       </w:pPr>
     </w:p>
     <w:p>
@@ -340,7 +336,7 @@
         <w:spacing w:line="240" w:lineRule="auto"/>
         <w:ind w:leftChars="0"/>
         <w:rPr>
-          <w:rFonts w:ascii="맑은 고딕" w:eastAsia="맑은 고딕" w:hAnsi="맑은 고딕" w:cs="맑은 고딕" w:hint="eastAsia"/>
+          <w:rFonts w:ascii="맑은 고딕" w:eastAsia="맑은 고딕" w:hAnsi="맑은 고딕" w:cs="맑은 고딕"/>
           <w:bCs/>
           <w:color w:val="0D1B2A"/>
           <w:szCs w:val="20"/>
@@ -463,9 +459,6 @@
         <w:pStyle w:val="a3"/>
         <w:spacing w:line="240" w:lineRule="auto"/>
         <w:ind w:leftChars="0"/>
-        <w:rPr>
-          <w:rFonts w:hint="eastAsia"/>
-        </w:rPr>
       </w:pPr>
     </w:p>
     <w:p>
@@ -756,9 +749,6 @@
     <w:p>
       <w:pPr>
         <w:spacing w:line="240" w:lineRule="auto"/>
-        <w:rPr>
-          <w:rFonts w:hint="eastAsia"/>
-        </w:rPr>
       </w:pPr>
     </w:p>
     <w:p>
@@ -834,12 +824,6 @@
         <w:gridCol w:w="1702"/>
       </w:tblGrid>
       <w:tr>
-        <w:tblPrEx>
-          <w:tblCellMar>
-            <w:top w:w="0" w:type="dxa"/>
-            <w:bottom w:w="0" w:type="dxa"/>
-          </w:tblCellMar>
-        </w:tblPrEx>
         <w:tc>
           <w:tcPr>
             <w:tcW w:w="1702" w:type="dxa"/>
@@ -1059,26 +1043,12 @@
                 <w:sz w:val="17"/>
                 <w:szCs w:val="17"/>
               </w:rPr>
-              <w:t>STEP 0</w:t>
-            </w:r>
-            <w:r>
-              <w:rPr>
-                <w:rFonts w:ascii="Arial" w:eastAsia="Arial" w:hAnsi="Arial" w:cs="Arial"/>
-                <w:b/>
-                <w:bCs/>
-                <w:color w:val="007B8A"/>
-                <w:sz w:val="17"/>
-                <w:szCs w:val="17"/>
-              </w:rPr>
-              <w:t>4</w:t>
+              <w:t>STEP 04</w:t>
             </w:r>
           </w:p>
           <w:p>
             <w:pPr>
               <w:spacing w:after="60"/>
-              <w:rPr>
-                <w:rFonts w:hint="eastAsia"/>
-              </w:rPr>
             </w:pPr>
             <w:r>
               <w:rPr>
@@ -1257,12 +1227,6 @@
         <w:gridCol w:w="2599"/>
       </w:tblGrid>
       <w:tr>
-        <w:tblPrEx>
-          <w:tblCellMar>
-            <w:top w:w="0" w:type="dxa"/>
-            <w:bottom w:w="0" w:type="dxa"/>
-          </w:tblCellMar>
-        </w:tblPrEx>
         <w:tc>
           <w:tcPr>
             <w:tcW w:w="2062" w:type="dxa"/>
@@ -1355,12 +1319,6 @@
         </w:tc>
       </w:tr>
       <w:tr>
-        <w:tblPrEx>
-          <w:tblCellMar>
-            <w:top w:w="0" w:type="dxa"/>
-            <w:bottom w:w="0" w:type="dxa"/>
-          </w:tblCellMar>
-        </w:tblPrEx>
         <w:tc>
           <w:tcPr>
             <w:tcW w:w="2062" w:type="dxa"/>
@@ -1458,12 +1416,6 @@
         </w:tc>
       </w:tr>
       <w:tr>
-        <w:tblPrEx>
-          <w:tblCellMar>
-            <w:top w:w="0" w:type="dxa"/>
-            <w:bottom w:w="0" w:type="dxa"/>
-          </w:tblCellMar>
-        </w:tblPrEx>
         <w:tc>
           <w:tcPr>
             <w:tcW w:w="2062" w:type="dxa"/>
@@ -1561,12 +1513,6 @@
         </w:tc>
       </w:tr>
       <w:tr>
-        <w:tblPrEx>
-          <w:tblCellMar>
-            <w:top w:w="0" w:type="dxa"/>
-            <w:bottom w:w="0" w:type="dxa"/>
-          </w:tblCellMar>
-        </w:tblPrEx>
         <w:tc>
           <w:tcPr>
             <w:tcW w:w="2062" w:type="dxa"/>
@@ -1665,12 +1611,6 @@
         </w:tc>
       </w:tr>
       <w:tr>
-        <w:tblPrEx>
-          <w:tblCellMar>
-            <w:top w:w="0" w:type="dxa"/>
-            <w:bottom w:w="0" w:type="dxa"/>
-          </w:tblCellMar>
-        </w:tblPrEx>
         <w:tc>
           <w:tcPr>
             <w:tcW w:w="2062" w:type="dxa"/>
@@ -1799,12 +1739,6 @@
         </w:tc>
       </w:tr>
       <w:tr>
-        <w:tblPrEx>
-          <w:tblCellMar>
-            <w:top w:w="0" w:type="dxa"/>
-            <w:bottom w:w="0" w:type="dxa"/>
-          </w:tblCellMar>
-        </w:tblPrEx>
         <w:tc>
           <w:tcPr>
             <w:tcW w:w="2062" w:type="dxa"/>
@@ -1902,12 +1836,6 @@
         </w:tc>
       </w:tr>
       <w:tr>
-        <w:tblPrEx>
-          <w:tblCellMar>
-            <w:top w:w="0" w:type="dxa"/>
-            <w:bottom w:w="0" w:type="dxa"/>
-          </w:tblCellMar>
-        </w:tblPrEx>
         <w:tc>
           <w:tcPr>
             <w:tcW w:w="2062" w:type="dxa"/>
@@ -2016,12 +1944,6 @@
         </w:tc>
       </w:tr>
       <w:tr>
-        <w:tblPrEx>
-          <w:tblCellMar>
-            <w:top w:w="0" w:type="dxa"/>
-            <w:bottom w:w="0" w:type="dxa"/>
-          </w:tblCellMar>
-        </w:tblPrEx>
         <w:tc>
           <w:tcPr>
             <w:tcW w:w="2062" w:type="dxa"/>
@@ -2130,12 +2052,6 @@
         </w:tc>
       </w:tr>
       <w:tr>
-        <w:tblPrEx>
-          <w:tblCellMar>
-            <w:top w:w="0" w:type="dxa"/>
-            <w:bottom w:w="0" w:type="dxa"/>
-          </w:tblCellMar>
-        </w:tblPrEx>
         <w:tc>
           <w:tcPr>
             <w:tcW w:w="2062" w:type="dxa"/>
@@ -2256,12 +2172,119 @@
     <w:p>
       <w:pPr>
         <w:spacing w:line="240" w:lineRule="auto"/>
+      </w:pPr>
+    </w:p>
+    <w:p>
+      <w:pPr>
+        <w:pStyle w:val="a3"/>
+        <w:numPr>
+          <w:ilvl w:val="0"/>
+          <w:numId w:val="13"/>
+        </w:numPr>
+        <w:spacing w:line="240" w:lineRule="auto"/>
+        <w:ind w:leftChars="0"/>
+      </w:pPr>
+      <w:r>
+        <w:t xml:space="preserve">UI </w:t>
+      </w:r>
+      <w:proofErr w:type="spellStart"/>
+      <w:r>
         <w:rPr>
           <w:rFonts w:hint="eastAsia"/>
         </w:rPr>
-      </w:pPr>
-      <w:bookmarkStart w:id="0" w:name="_GoBack"/>
-      <w:bookmarkEnd w:id="0"/>
+        <w:t>목업</w:t>
+      </w:r>
+      <w:proofErr w:type="spellEnd"/>
+    </w:p>
+    <w:p>
+      <w:pPr>
+        <w:pStyle w:val="a3"/>
+        <w:spacing w:line="240" w:lineRule="auto"/>
+        <w:ind w:leftChars="0"/>
+      </w:pPr>
+      <w:proofErr w:type="spellStart"/>
+      <w:r>
+        <w:rPr>
+          <w:rFonts w:hint="eastAsia"/>
+        </w:rPr>
+        <w:t>카우누리</w:t>
+      </w:r>
+      <w:proofErr w:type="spellEnd"/>
+      <w:r>
+        <w:t>(</w:t>
+      </w:r>
+      <w:r>
+        <w:rPr>
+          <w:rFonts w:hint="eastAsia"/>
+        </w:rPr>
+        <w:t>E</w:t>
+      </w:r>
+      <w:r>
+        <w:t xml:space="preserve">MR) </w:t>
+      </w:r>
+      <w:r>
+        <w:rPr>
+          <w:rFonts w:hint="eastAsia"/>
+        </w:rPr>
+        <w:t>시스템에서 기능 추가</w:t>
+      </w:r>
+    </w:p>
+    <w:p>
+      <w:pPr>
+        <w:pStyle w:val="a3"/>
+        <w:spacing w:line="240" w:lineRule="auto"/>
+        <w:ind w:leftChars="0"/>
+        <w:rPr>
+          <w:rFonts w:hint="eastAsia"/>
+        </w:rPr>
+      </w:pPr>
+      <w:r>
+        <w:rPr>
+          <w:rFonts w:hint="eastAsia"/>
+          <w:noProof/>
+        </w:rPr>
+        <w:drawing>
+          <wp:inline distT="0" distB="0" distL="0" distR="0">
+            <wp:extent cx="5300804" cy="2650402"/>
+            <wp:effectExtent l="0" t="0" r="0" b="0"/>
+            <wp:docPr id="1" name="그림 1"/>
+            <wp:cNvGraphicFramePr>
+              <a:graphicFrameLocks xmlns:a="http://schemas.openxmlformats.org/drawingml/2006/main" noChangeAspect="1"/>
+            </wp:cNvGraphicFramePr>
+            <a:graphic xmlns:a="http://schemas.openxmlformats.org/drawingml/2006/main">
+              <a:graphicData uri="http://schemas.openxmlformats.org/drawingml/2006/picture">
+                <pic:pic xmlns:pic="http://schemas.openxmlformats.org/drawingml/2006/picture">
+                  <pic:nvPicPr>
+                    <pic:cNvPr id="1" name="스크린샷 2026-03-27 091359.png"/>
+                    <pic:cNvPicPr/>
+                  </pic:nvPicPr>
+                  <pic:blipFill>
+                    <a:blip r:embed="rId7" cstate="print">
+                      <a:extLst>
+                        <a:ext uri="{28A0092B-C50C-407E-A947-70E740481C1C}">
+                          <a14:useLocalDpi xmlns:a14="http://schemas.microsoft.com/office/drawing/2010/main" val="0"/>
+                        </a:ext>
+                      </a:extLst>
+                    </a:blip>
+                    <a:stretch>
+                      <a:fillRect/>
+                    </a:stretch>
+                  </pic:blipFill>
+                  <pic:spPr>
+                    <a:xfrm>
+                      <a:off x="0" y="0"/>
+                      <a:ext cx="5309090" cy="2654545"/>
+                    </a:xfrm>
+                    <a:prstGeom prst="rect">
+                      <a:avLst/>
+                    </a:prstGeom>
+                  </pic:spPr>
+                </pic:pic>
+              </a:graphicData>
+            </a:graphic>
+          </wp:inline>
+        </w:drawing>
+      </w:r>
     </w:p>
     <w:sectPr>
       <w:pgSz w:w="11906" w:h="16838"/>
@@ -2273,9 +2296,145 @@
 </w:document>
 </file>
 
+<file path=word/endnotes.xml><?xml version="1.0" encoding="utf-8"?>
+<w:endnotes xmlns:wpc="http://schemas.microsoft.com/office/word/2010/wordprocessingCanvas" xmlns:cx="http://schemas.microsoft.com/office/drawing/2014/chartex" xmlns:cx1="http://schemas.microsoft.com/office/drawing/2015/9/8/chartex" xmlns:cx2="http://schemas.microsoft.com/office/drawing/2015/10/21/chartex" xmlns:cx3="http://schemas.microsoft.com/office/drawing/2016/5/9/chartex" xmlns:cx4="http://schemas.microsoft.com/office/drawing/2016/5/10/chartex" xmlns:cx5="http://schemas.microsoft.com/office/drawing/2016/5/11/chartex" xmlns:cx6="http://schemas.microsoft.com/office/drawing/2016/5/12/chartex" xmlns:cx7="http://schemas.microsoft.com/office/drawing/2016/5/13/chartex" xmlns:cx8="http://schemas.microsoft.com/office/drawing/2016/5/14/chartex" xmlns:mc="http://schemas.openxmlformats.org/markup-compatibility/2006" xmlns:aink="http://schemas.microsoft.com/office/drawing/2016/ink" xmlns:am3d="http://schemas.microsoft.com/office/drawing/2017/model3d" xmlns:o="urn:schemas-microsoft-com:office:office" xmlns:r="http://schemas.openxmlformats.org/officeDocument/2006/relationships" xmlns:m="http://schemas.openxmlformats.org/officeDocument/2006/math" xmlns:v="urn:schemas-microsoft-com:vml" xmlns:wp14="http://schemas.microsoft.com/office/word/2010/wordprocessingDrawing" xmlns:wp="http://schemas.openxmlformats.org/drawingml/2006/wordprocessingDrawing" xmlns:w10="urn:schemas-microsoft-com:office:word" xmlns:w="http://schemas.openxmlformats.org/wordprocessingml/2006/main" xmlns:w14="http://schemas.microsoft.com/office/word/2010/wordml" xmlns:w15="http://schemas.microsoft.com/office/word/2012/wordml" xmlns:w16cid="http://schemas.microsoft.com/office/word/2016/wordml/cid" xmlns:w16se="http://schemas.microsoft.com/office/word/2015/wordml/symex" xmlns:wpg="http://schemas.microsoft.com/office/word/2010/wordprocessingGroup" xmlns:wpi="http://schemas.microsoft.com/office/word/2010/wordprocessingInk" xmlns:wne="http://schemas.microsoft.com/office/word/2006/wordml" xmlns:wps="http://schemas.microsoft.com/office/word/2010/wordprocessingShape" mc:Ignorable="w14 w15 w16se w16cid wp14">
+  <w:endnote w:type="separator" w:id="-1">
+    <w:p>
+      <w:pPr>
+        <w:spacing w:after="0" w:line="240" w:lineRule="auto"/>
+      </w:pPr>
+      <w:r>
+        <w:separator/>
+      </w:r>
+    </w:p>
+  </w:endnote>
+  <w:endnote w:type="continuationSeparator" w:id="0">
+    <w:p>
+      <w:pPr>
+        <w:spacing w:after="0" w:line="240" w:lineRule="auto"/>
+      </w:pPr>
+      <w:r>
+        <w:continuationSeparator/>
+      </w:r>
+    </w:p>
+  </w:endnote>
+</w:endnotes>
+</file>
+
+<file path=word/footnotes.xml><?xml version="1.0" encoding="utf-8"?>
+<w:footnotes xmlns:wpc="http://schemas.microsoft.com/office/word/2010/wordprocessingCanvas" xmlns:cx="http://schemas.microsoft.com/office/drawing/2014/chartex" xmlns:cx1="http://schemas.microsoft.com/office/drawing/2015/9/8/chartex" xmlns:cx2="http://schemas.microsoft.com/office/drawing/2015/10/21/chartex" xmlns:cx3="http://schemas.microsoft.com/office/drawing/2016/5/9/chartex" xmlns:cx4="http://schemas.microsoft.com/office/drawing/2016/5/10/chartex" xmlns:cx5="http://schemas.microsoft.com/office/drawing/2016/5/11/chartex" xmlns:cx6="http://schemas.microsoft.com/office/drawing/2016/5/12/chartex" xmlns:cx7="http://schemas.microsoft.com/office/drawing/2016/5/13/chartex" xmlns:cx8="http://schemas.microsoft.com/office/drawing/2016/5/14/chartex" xmlns:mc="http://schemas.openxmlformats.org/markup-compatibility/2006" xmlns:aink="http://schemas.microsoft.com/office/drawing/2016/ink" xmlns:am3d="http://schemas.microsoft.com/office/drawing/2017/model3d" xmlns:o="urn:schemas-microsoft-com:office:office" xmlns:r="http://schemas.openxmlformats.org/officeDocument/2006/relationships" xmlns:m="http://schemas.openxmlformats.org/officeDocument/2006/math" xmlns:v="urn:schemas-microsoft-com:vml" xmlns:wp14="http://schemas.microsoft.com/office/word/2010/wordprocessingDrawing" xmlns:wp="http://schemas.openxmlformats.org/drawingml/2006/wordprocessingDrawing" xmlns:w10="urn:schemas-microsoft-com:office:word" xmlns:w="http://schemas.openxmlformats.org/wordprocessingml/2006/main" xmlns:w14="http://schemas.microsoft.com/office/word/2010/wordml" xmlns:w15="http://schemas.microsoft.com/office/word/2012/wordml" xmlns:w16cid="http://schemas.microsoft.com/office/word/2016/wordml/cid" xmlns:w16se="http://schemas.microsoft.com/office/word/2015/wordml/symex" xmlns:wpg="http://schemas.microsoft.com/office/word/2010/wordprocessingGroup" xmlns:wpi="http://schemas.microsoft.com/office/word/2010/wordprocessingInk" xmlns:wne="http://schemas.microsoft.com/office/word/2006/wordml" xmlns:wps="http://schemas.microsoft.com/office/word/2010/wordprocessingShape" mc:Ignorable="w14 w15 w16se w16cid wp14">
+  <w:footnote w:type="separator" w:id="-1">
+    <w:p>
+      <w:pPr>
+        <w:spacing w:after="0" w:line="240" w:lineRule="auto"/>
+      </w:pPr>
+      <w:r>
+        <w:separator/>
+      </w:r>
+    </w:p>
+  </w:footnote>
+  <w:footnote w:type="continuationSeparator" w:id="0">
+    <w:p>
+      <w:pPr>
+        <w:spacing w:after="0" w:line="240" w:lineRule="auto"/>
+      </w:pPr>
+      <w:r>
+        <w:continuationSeparator/>
+      </w:r>
+    </w:p>
+  </w:footnote>
+</w:footnotes>
+</file>
+
 <file path=word/numbering.xml><?xml version="1.0" encoding="utf-8"?>
 <w:numbering xmlns:wpc="http://schemas.microsoft.com/office/word/2010/wordprocessingCanvas" xmlns:cx="http://schemas.microsoft.com/office/drawing/2014/chartex" xmlns:cx1="http://schemas.microsoft.com/office/drawing/2015/9/8/chartex" xmlns:cx2="http://schemas.microsoft.com/office/drawing/2015/10/21/chartex" xmlns:cx3="http://schemas.microsoft.com/office/drawing/2016/5/9/chartex" xmlns:cx4="http://schemas.microsoft.com/office/drawing/2016/5/10/chartex" xmlns:cx5="http://schemas.microsoft.com/office/drawing/2016/5/11/chartex" xmlns:cx6="http://schemas.microsoft.com/office/drawing/2016/5/12/chartex" xmlns:cx7="http://schemas.microsoft.com/office/drawing/2016/5/13/chartex" xmlns:cx8="http://schemas.microsoft.com/office/drawing/2016/5/14/chartex" xmlns:mc="http://schemas.openxmlformats.org/markup-compatibility/2006" xmlns:aink="http://schemas.microsoft.com/office/drawing/2016/ink" xmlns:am3d="http://schemas.microsoft.com/office/drawing/2017/model3d" xmlns:o="urn:schemas-microsoft-com:office:office" xmlns:r="http://schemas.openxmlformats.org/officeDocument/2006/relationships" xmlns:m="http://schemas.openxmlformats.org/officeDocument/2006/math" xmlns:v="urn:schemas-microsoft-com:vml" xmlns:wp14="http://schemas.microsoft.com/office/word/2010/wordprocessingDrawing" xmlns:wp="http://schemas.openxmlformats.org/drawingml/2006/wordprocessingDrawing" xmlns:w10="urn:schemas-microsoft-com:office:word" xmlns:w="http://schemas.openxmlformats.org/wordprocessingml/2006/main" xmlns:w14="http://schemas.microsoft.com/office/word/2010/wordml" xmlns:w15="http://schemas.microsoft.com/office/word/2012/wordml" xmlns:w16cid="http://schemas.microsoft.com/office/word/2016/wordml/cid" xmlns:w16se="http://schemas.microsoft.com/office/word/2015/wordml/symex" xmlns:wpg="http://schemas.microsoft.com/office/word/2010/wordprocessingGroup" xmlns:wpi="http://schemas.microsoft.com/office/word/2010/wordprocessingInk" xmlns:wne="http://schemas.microsoft.com/office/word/2006/wordml" xmlns:wps="http://schemas.microsoft.com/office/word/2010/wordprocessingShape" mc:Ignorable="w14 w15 w16se w16cid wp14">
   <w:abstractNum w:abstractNumId="0" w15:restartNumberingAfterBreak="0">
+    <w:nsid w:val="02CD22D3"/>
+    <w:multiLevelType w:val="hybridMultilevel"/>
+    <w:tmpl w:val="40AA24F6"/>
+    <w:lvl w:ilvl="0" w:tplc="0409000F">
+      <w:start w:val="1"/>
+      <w:numFmt w:val="decimal"/>
+      <w:lvlText w:val="%1."/>
+      <w:lvlJc w:val="left"/>
+      <w:pPr>
+        <w:ind w:left="800" w:hanging="400"/>
+      </w:pPr>
+    </w:lvl>
+    <w:lvl w:ilvl="1" w:tplc="04090019" w:tentative="1">
+      <w:start w:val="1"/>
+      <w:numFmt w:val="upperLetter"/>
+      <w:lvlText w:val="%2."/>
+      <w:lvlJc w:val="left"/>
+      <w:pPr>
+        <w:ind w:left="1200" w:hanging="400"/>
+      </w:pPr>
+    </w:lvl>
+    <w:lvl w:ilvl="2" w:tplc="0409001B" w:tentative="1">
+      <w:start w:val="1"/>
+      <w:numFmt w:val="lowerRoman"/>
+      <w:lvlText w:val="%3."/>
+      <w:lvlJc w:val="right"/>
+      <w:pPr>
+        <w:ind w:left="1600" w:hanging="400"/>
+      </w:pPr>
+    </w:lvl>
+    <w:lvl w:ilvl="3" w:tplc="0409000F" w:tentative="1">
+      <w:start w:val="1"/>
+      <w:numFmt w:val="decimal"/>
+      <w:lvlText w:val="%4."/>
+      <w:lvlJc w:val="left"/>
+      <w:pPr>
+        <w:ind w:left="2000" w:hanging="400"/>
+      </w:pPr>
+    </w:lvl>
+    <w:lvl w:ilvl="4" w:tplc="04090019" w:tentative="1">
+      <w:start w:val="1"/>
+      <w:numFmt w:val="upperLetter"/>
+      <w:lvlText w:val="%5."/>
+      <w:lvlJc w:val="left"/>
+      <w:pPr>
+        <w:ind w:left="2400" w:hanging="400"/>
+      </w:pPr>
+    </w:lvl>
+    <w:lvl w:ilvl="5" w:tplc="0409001B" w:tentative="1">
+      <w:start w:val="1"/>
+      <w:numFmt w:val="lowerRoman"/>
+      <w:lvlText w:val="%6."/>
+      <w:lvlJc w:val="right"/>
+      <w:pPr>
+        <w:ind w:left="2800" w:hanging="400"/>
+      </w:pPr>
+    </w:lvl>
+    <w:lvl w:ilvl="6" w:tplc="0409000F" w:tentative="1">
+      <w:start w:val="1"/>
+      <w:numFmt w:val="decimal"/>
+      <w:lvlText w:val="%7."/>
+      <w:lvlJc w:val="left"/>
+      <w:pPr>
+        <w:ind w:left="3200" w:hanging="400"/>
+      </w:pPr>
+    </w:lvl>
+    <w:lvl w:ilvl="7" w:tplc="04090019" w:tentative="1">
+      <w:start w:val="1"/>
+      <w:numFmt w:val="upperLetter"/>
+      <w:lvlText w:val="%8."/>
+      <w:lvlJc w:val="left"/>
+      <w:pPr>
+        <w:ind w:left="3600" w:hanging="400"/>
+      </w:pPr>
+    </w:lvl>
+    <w:lvl w:ilvl="8" w:tplc="0409001B" w:tentative="1">
+      <w:start w:val="1"/>
+      <w:numFmt w:val="lowerRoman"/>
+      <w:lvlText w:val="%9."/>
+      <w:lvlJc w:val="right"/>
+      <w:pPr>
+        <w:ind w:left="4000" w:hanging="400"/>
+      </w:pPr>
+    </w:lvl>
+  </w:abstractNum>
+  <w:abstractNum w:abstractNumId="1" w15:restartNumberingAfterBreak="0">
     <w:nsid w:val="101078D3"/>
     <w:multiLevelType w:val="hybridMultilevel"/>
     <w:tmpl w:val="30C8ECEE"/>
@@ -2388,7 +2547,7 @@
       </w:rPr>
     </w:lvl>
   </w:abstractNum>
-  <w:abstractNum w:abstractNumId="1" w15:restartNumberingAfterBreak="0">
+  <w:abstractNum w:abstractNumId="2" w15:restartNumberingAfterBreak="0">
     <w:nsid w:val="164E730D"/>
     <w:multiLevelType w:val="hybridMultilevel"/>
     <w:tmpl w:val="530EA05E"/>
@@ -2476,7 +2635,7 @@
       </w:pPr>
     </w:lvl>
   </w:abstractNum>
-  <w:abstractNum w:abstractNumId="2" w15:restartNumberingAfterBreak="0">
+  <w:abstractNum w:abstractNumId="3" w15:restartNumberingAfterBreak="0">
     <w:nsid w:val="1A8D50DE"/>
     <w:multiLevelType w:val="hybridMultilevel"/>
     <w:tmpl w:val="44B08A76"/>
@@ -2589,7 +2748,7 @@
       </w:rPr>
     </w:lvl>
   </w:abstractNum>
-  <w:abstractNum w:abstractNumId="3" w15:restartNumberingAfterBreak="0">
+  <w:abstractNum w:abstractNumId="4" w15:restartNumberingAfterBreak="0">
     <w:nsid w:val="21974C98"/>
     <w:multiLevelType w:val="hybridMultilevel"/>
     <w:tmpl w:val="DDDCF934"/>
@@ -2702,7 +2861,120 @@
       </w:rPr>
     </w:lvl>
   </w:abstractNum>
-  <w:abstractNum w:abstractNumId="4" w15:restartNumberingAfterBreak="0">
+  <w:abstractNum w:abstractNumId="5" w15:restartNumberingAfterBreak="0">
+    <w:nsid w:val="268A3F85"/>
+    <w:multiLevelType w:val="hybridMultilevel"/>
+    <w:tmpl w:val="1B42336E"/>
+    <w:lvl w:ilvl="0" w:tplc="04090003">
+      <w:start w:val="1"/>
+      <w:numFmt w:val="bullet"/>
+      <w:lvlText w:val=""/>
+      <w:lvlJc w:val="left"/>
+      <w:pPr>
+        <w:ind w:left="800" w:hanging="400"/>
+      </w:pPr>
+      <w:rPr>
+        <w:rFonts w:ascii="Wingdings" w:hAnsi="Wingdings" w:hint="default"/>
+      </w:rPr>
+    </w:lvl>
+    <w:lvl w:ilvl="1" w:tplc="04090003" w:tentative="1">
+      <w:start w:val="1"/>
+      <w:numFmt w:val="bullet"/>
+      <w:lvlText w:val=""/>
+      <w:lvlJc w:val="left"/>
+      <w:pPr>
+        <w:ind w:left="1200" w:hanging="400"/>
+      </w:pPr>
+      <w:rPr>
+        <w:rFonts w:ascii="Wingdings" w:hAnsi="Wingdings" w:hint="default"/>
+      </w:rPr>
+    </w:lvl>
+    <w:lvl w:ilvl="2" w:tplc="04090005" w:tentative="1">
+      <w:start w:val="1"/>
+      <w:numFmt w:val="bullet"/>
+      <w:lvlText w:val=""/>
+      <w:lvlJc w:val="left"/>
+      <w:pPr>
+        <w:ind w:left="1600" w:hanging="400"/>
+      </w:pPr>
+      <w:rPr>
+        <w:rFonts w:ascii="Wingdings" w:hAnsi="Wingdings" w:hint="default"/>
+      </w:rPr>
+    </w:lvl>
+    <w:lvl w:ilvl="3" w:tplc="04090001" w:tentative="1">
+      <w:start w:val="1"/>
+      <w:numFmt w:val="bullet"/>
+      <w:lvlText w:val=""/>
+      <w:lvlJc w:val="left"/>
+      <w:pPr>
+        <w:ind w:left="2000" w:hanging="400"/>
+      </w:pPr>
+      <w:rPr>
+        <w:rFonts w:ascii="Wingdings" w:hAnsi="Wingdings" w:hint="default"/>
+      </w:rPr>
+    </w:lvl>
+    <w:lvl w:ilvl="4" w:tplc="04090003" w:tentative="1">
+      <w:start w:val="1"/>
+      <w:numFmt w:val="bullet"/>
+      <w:lvlText w:val=""/>
+      <w:lvlJc w:val="left"/>
+      <w:pPr>
+        <w:ind w:left="2400" w:hanging="400"/>
+      </w:pPr>
+      <w:rPr>
+        <w:rFonts w:ascii="Wingdings" w:hAnsi="Wingdings" w:hint="default"/>
+      </w:rPr>
+    </w:lvl>
+    <w:lvl w:ilvl="5" w:tplc="04090005" w:tentative="1">
+      <w:start w:val="1"/>
+      <w:numFmt w:val="bullet"/>
+      <w:lvlText w:val=""/>
+      <w:lvlJc w:val="left"/>
+      <w:pPr>
+        <w:ind w:left="2800" w:hanging="400"/>
+      </w:pPr>
+      <w:rPr>
+        <w:rFonts w:ascii="Wingdings" w:hAnsi="Wingdings" w:hint="default"/>
+      </w:rPr>
+    </w:lvl>
+    <w:lvl w:ilvl="6" w:tplc="04090001" w:tentative="1">
+      <w:start w:val="1"/>
+      <w:numFmt w:val="bullet"/>
+      <w:lvlText w:val=""/>
+      <w:lvlJc w:val="left"/>
+      <w:pPr>
+        <w:ind w:left="3200" w:hanging="400"/>
+      </w:pPr>
+      <w:rPr>
+        <w:rFonts w:ascii="Wingdings" w:hAnsi="Wingdings" w:hint="default"/>
+      </w:rPr>
+    </w:lvl>
+    <w:lvl w:ilvl="7" w:tplc="04090003" w:tentative="1">
+      <w:start w:val="1"/>
+      <w:numFmt w:val="bullet"/>
+      <w:lvlText w:val=""/>
+      <w:lvlJc w:val="left"/>
+      <w:pPr>
+        <w:ind w:left="3600" w:hanging="400"/>
+      </w:pPr>
+      <w:rPr>
+        <w:rFonts w:ascii="Wingdings" w:hAnsi="Wingdings" w:hint="default"/>
+      </w:rPr>
+    </w:lvl>
+    <w:lvl w:ilvl="8" w:tplc="04090005" w:tentative="1">
+      <w:start w:val="1"/>
+      <w:numFmt w:val="bullet"/>
+      <w:lvlText w:val=""/>
+      <w:lvlJc w:val="left"/>
+      <w:pPr>
+        <w:ind w:left="4000" w:hanging="400"/>
+      </w:pPr>
+      <w:rPr>
+        <w:rFonts w:ascii="Wingdings" w:hAnsi="Wingdings" w:hint="default"/>
+      </w:rPr>
+    </w:lvl>
+  </w:abstractNum>
+  <w:abstractNum w:abstractNumId="6" w15:restartNumberingAfterBreak="0">
     <w:nsid w:val="2ADC731F"/>
     <w:multiLevelType w:val="hybridMultilevel"/>
     <w:tmpl w:val="02C000BA"/>
@@ -2791,7 +3063,7 @@
       </w:pPr>
     </w:lvl>
   </w:abstractNum>
-  <w:abstractNum w:abstractNumId="5" w15:restartNumberingAfterBreak="0">
+  <w:abstractNum w:abstractNumId="7" w15:restartNumberingAfterBreak="0">
     <w:nsid w:val="379F7D35"/>
     <w:multiLevelType w:val="hybridMultilevel"/>
     <w:tmpl w:val="5510D3BC"/>
@@ -2904,7 +3176,7 @@
       </w:rPr>
     </w:lvl>
   </w:abstractNum>
-  <w:abstractNum w:abstractNumId="6" w15:restartNumberingAfterBreak="0">
+  <w:abstractNum w:abstractNumId="8" w15:restartNumberingAfterBreak="0">
     <w:nsid w:val="405717EB"/>
     <w:multiLevelType w:val="hybridMultilevel"/>
     <w:tmpl w:val="AAFE5120"/>
@@ -3017,7 +3289,7 @@
       </w:rPr>
     </w:lvl>
   </w:abstractNum>
-  <w:abstractNum w:abstractNumId="7" w15:restartNumberingAfterBreak="0">
+  <w:abstractNum w:abstractNumId="9" w15:restartNumberingAfterBreak="0">
     <w:nsid w:val="42102ECC"/>
     <w:multiLevelType w:val="hybridMultilevel"/>
     <w:tmpl w:val="4CACD3AC"/>
@@ -3106,7 +3378,7 @@
       </w:pPr>
     </w:lvl>
   </w:abstractNum>
-  <w:abstractNum w:abstractNumId="8" w15:restartNumberingAfterBreak="0">
+  <w:abstractNum w:abstractNumId="10" w15:restartNumberingAfterBreak="0">
     <w:nsid w:val="60A32607"/>
     <w:multiLevelType w:val="hybridMultilevel"/>
     <w:tmpl w:val="A49EBC1C"/>
@@ -3195,7 +3467,7 @@
       </w:pPr>
     </w:lvl>
   </w:abstractNum>
-  <w:abstractNum w:abstractNumId="9" w15:restartNumberingAfterBreak="0">
+  <w:abstractNum w:abstractNumId="11" w15:restartNumberingAfterBreak="0">
     <w:nsid w:val="61943C49"/>
     <w:multiLevelType w:val="hybridMultilevel"/>
     <w:tmpl w:val="43E8A8E8"/>
@@ -3308,35 +3580,157 @@
       </w:rPr>
     </w:lvl>
   </w:abstractNum>
+  <w:abstractNum w:abstractNumId="12" w15:restartNumberingAfterBreak="0">
+    <w:nsid w:val="63FC7462"/>
+    <w:multiLevelType w:val="hybridMultilevel"/>
+    <w:tmpl w:val="3DA08952"/>
+    <w:lvl w:ilvl="0" w:tplc="04090001">
+      <w:start w:val="1"/>
+      <w:numFmt w:val="bullet"/>
+      <w:lvlText w:val=""/>
+      <w:lvlJc w:val="left"/>
+      <w:pPr>
+        <w:ind w:left="800" w:hanging="400"/>
+      </w:pPr>
+      <w:rPr>
+        <w:rFonts w:ascii="Wingdings" w:hAnsi="Wingdings" w:hint="default"/>
+      </w:rPr>
+    </w:lvl>
+    <w:lvl w:ilvl="1" w:tplc="04090003" w:tentative="1">
+      <w:start w:val="1"/>
+      <w:numFmt w:val="bullet"/>
+      <w:lvlText w:val=""/>
+      <w:lvlJc w:val="left"/>
+      <w:pPr>
+        <w:ind w:left="1200" w:hanging="400"/>
+      </w:pPr>
+      <w:rPr>
+        <w:rFonts w:ascii="Wingdings" w:hAnsi="Wingdings" w:hint="default"/>
+      </w:rPr>
+    </w:lvl>
+    <w:lvl w:ilvl="2" w:tplc="04090005" w:tentative="1">
+      <w:start w:val="1"/>
+      <w:numFmt w:val="bullet"/>
+      <w:lvlText w:val=""/>
+      <w:lvlJc w:val="left"/>
+      <w:pPr>
+        <w:ind w:left="1600" w:hanging="400"/>
+      </w:pPr>
+      <w:rPr>
+        <w:rFonts w:ascii="Wingdings" w:hAnsi="Wingdings" w:hint="default"/>
+      </w:rPr>
+    </w:lvl>
+    <w:lvl w:ilvl="3" w:tplc="04090001" w:tentative="1">
+      <w:start w:val="1"/>
+      <w:numFmt w:val="bullet"/>
+      <w:lvlText w:val=""/>
+      <w:lvlJc w:val="left"/>
+      <w:pPr>
+        <w:ind w:left="2000" w:hanging="400"/>
+      </w:pPr>
+      <w:rPr>
+        <w:rFonts w:ascii="Wingdings" w:hAnsi="Wingdings" w:hint="default"/>
+      </w:rPr>
+    </w:lvl>
+    <w:lvl w:ilvl="4" w:tplc="04090003" w:tentative="1">
+      <w:start w:val="1"/>
+      <w:numFmt w:val="bullet"/>
+      <w:lvlText w:val=""/>
+      <w:lvlJc w:val="left"/>
+      <w:pPr>
+        <w:ind w:left="2400" w:hanging="400"/>
+      </w:pPr>
+      <w:rPr>
+        <w:rFonts w:ascii="Wingdings" w:hAnsi="Wingdings" w:hint="default"/>
+      </w:rPr>
+    </w:lvl>
+    <w:lvl w:ilvl="5" w:tplc="04090005" w:tentative="1">
+      <w:start w:val="1"/>
+      <w:numFmt w:val="bullet"/>
+      <w:lvlText w:val=""/>
+      <w:lvlJc w:val="left"/>
+      <w:pPr>
+        <w:ind w:left="2800" w:hanging="400"/>
+      </w:pPr>
+      <w:rPr>
+        <w:rFonts w:ascii="Wingdings" w:hAnsi="Wingdings" w:hint="default"/>
+      </w:rPr>
+    </w:lvl>
+    <w:lvl w:ilvl="6" w:tplc="04090001" w:tentative="1">
+      <w:start w:val="1"/>
+      <w:numFmt w:val="bullet"/>
+      <w:lvlText w:val=""/>
+      <w:lvlJc w:val="left"/>
+      <w:pPr>
+        <w:ind w:left="3200" w:hanging="400"/>
+      </w:pPr>
+      <w:rPr>
+        <w:rFonts w:ascii="Wingdings" w:hAnsi="Wingdings" w:hint="default"/>
+      </w:rPr>
+    </w:lvl>
+    <w:lvl w:ilvl="7" w:tplc="04090003" w:tentative="1">
+      <w:start w:val="1"/>
+      <w:numFmt w:val="bullet"/>
+      <w:lvlText w:val=""/>
+      <w:lvlJc w:val="left"/>
+      <w:pPr>
+        <w:ind w:left="3600" w:hanging="400"/>
+      </w:pPr>
+      <w:rPr>
+        <w:rFonts w:ascii="Wingdings" w:hAnsi="Wingdings" w:hint="default"/>
+      </w:rPr>
+    </w:lvl>
+    <w:lvl w:ilvl="8" w:tplc="04090005" w:tentative="1">
+      <w:start w:val="1"/>
+      <w:numFmt w:val="bullet"/>
+      <w:lvlText w:val=""/>
+      <w:lvlJc w:val="left"/>
+      <w:pPr>
+        <w:ind w:left="4000" w:hanging="400"/>
+      </w:pPr>
+      <w:rPr>
+        <w:rFonts w:ascii="Wingdings" w:hAnsi="Wingdings" w:hint="default"/>
+      </w:rPr>
+    </w:lvl>
+  </w:abstractNum>
   <w:num w:numId="1">
+    <w:abstractNumId w:val="10"/>
+  </w:num>
+  <w:num w:numId="2">
+    <w:abstractNumId w:val="9"/>
+  </w:num>
+  <w:num w:numId="3">
+    <w:abstractNumId w:val="7"/>
+  </w:num>
+  <w:num w:numId="4">
+    <w:abstractNumId w:val="3"/>
+  </w:num>
+  <w:num w:numId="5">
+    <w:abstractNumId w:val="1"/>
+  </w:num>
+  <w:num w:numId="6">
     <w:abstractNumId w:val="8"/>
   </w:num>
-  <w:num w:numId="2">
-    <w:abstractNumId w:val="7"/>
+  <w:num w:numId="7">
+    <w:abstractNumId w:val="11"/>
   </w:num>
-  <w:num w:numId="3">
-    <w:abstractNumId w:val="5"/>
-  </w:num>
-  <w:num w:numId="4">
+  <w:num w:numId="8">
     <w:abstractNumId w:val="2"/>
   </w:num>
-  <w:num w:numId="5">
+  <w:num w:numId="9">
+    <w:abstractNumId w:val="6"/>
+  </w:num>
+  <w:num w:numId="10">
+    <w:abstractNumId w:val="4"/>
+  </w:num>
+  <w:num w:numId="11">
+    <w:abstractNumId w:val="12"/>
+  </w:num>
+  <w:num w:numId="12">
     <w:abstractNumId w:val="0"/>
   </w:num>
-  <w:num w:numId="6">
-    <w:abstractNumId w:val="6"/>
-  </w:num>
-  <w:num w:numId="7">
-    <w:abstractNumId w:val="9"/>
-  </w:num>
-  <w:num w:numId="8">
-    <w:abstractNumId w:val="1"/>
-  </w:num>
-  <w:num w:numId="9">
-    <w:abstractNumId w:val="4"/>
-  </w:num>
-  <w:num w:numId="10">
-    <w:abstractNumId w:val="3"/>
+  <w:num w:numId="13">
+    <w:abstractNumId w:val="5"/>
   </w:num>
 </w:numbering>
 </file>
@@ -3783,6 +4177,50 @@
       <w:ind w:leftChars="400" w:left="800"/>
     </w:pPr>
   </w:style>
+  <w:style w:type="paragraph" w:styleId="a4">
+    <w:name w:val="header"/>
+    <w:basedOn w:val="a"/>
+    <w:link w:val="Char"/>
+    <w:uiPriority w:val="99"/>
+    <w:unhideWhenUsed/>
+    <w:rsid w:val="00B9505E"/>
+    <w:pPr>
+      <w:tabs>
+        <w:tab w:val="center" w:pos="4513"/>
+        <w:tab w:val="right" w:pos="9026"/>
+      </w:tabs>
+      <w:snapToGrid w:val="0"/>
+    </w:pPr>
+  </w:style>
+  <w:style w:type="character" w:customStyle="1" w:styleId="Char">
+    <w:name w:val="머리글 Char"/>
+    <w:basedOn w:val="a0"/>
+    <w:link w:val="a4"/>
+    <w:uiPriority w:val="99"/>
+    <w:rsid w:val="00B9505E"/>
+  </w:style>
+  <w:style w:type="paragraph" w:styleId="a5">
+    <w:name w:val="footer"/>
+    <w:basedOn w:val="a"/>
+    <w:link w:val="Char0"/>
+    <w:uiPriority w:val="99"/>
+    <w:unhideWhenUsed/>
+    <w:rsid w:val="00B9505E"/>
+    <w:pPr>
+      <w:tabs>
+        <w:tab w:val="center" w:pos="4513"/>
+        <w:tab w:val="right" w:pos="9026"/>
+      </w:tabs>
+      <w:snapToGrid w:val="0"/>
+    </w:pPr>
+  </w:style>
+  <w:style w:type="character" w:customStyle="1" w:styleId="Char0">
+    <w:name w:val="바닥글 Char"/>
+    <w:basedOn w:val="a0"/>
+    <w:link w:val="a5"/>
+    <w:uiPriority w:val="99"/>
+    <w:rsid w:val="00B9505E"/>
+  </w:style>
 </w:styles>
 </file>
 

</xml_diff>